<commit_message>
Remove fabricated rag-notes project and inflated metrics; lead with real paper + AIS3
</commit_message>
<xml_diff>
--- a/Tzu-Yen_Chang_Resume_Merged.docx
+++ b/Tzu-Yen_Chang_Resume_Merged.docx
@@ -1368,7 +1368,7 @@
                 <w:color w:val="10141A"/>
                 <w:sz w:val="21"/>
               </w:rPr>
-              <w:t>claude-finance</w:t>
+              <w:t>FakeAdDetector</w:t>
             </w:r>
             <w:r>
               <w:rPr>
@@ -1377,7 +1377,7 @@
                 <w:color w:val="6E7682"/>
                 <w:sz w:val="18"/>
               </w:rPr>
-              <w:t xml:space="preserve">    Python · Claude API · FastAPI · React</w:t>
+              <w:t xml:space="preserve">    Python · BERT · scikit-learn · Streamlit</w:t>
             </w:r>
           </w:p>
           <w:p>
@@ -1391,7 +1391,7 @@
                 <w:color w:val="4A525C"/>
                 <w:sz w:val="20"/>
               </w:rPr>
-              <w:t>Tool-using AI agent that reads bank statements and answers natural-language spending questions. 6 typed tools wrap a pandas + SQLite backend; hallucination rate 22% → 4% after retrieval-first prompting.</w:t>
+              <w:t>Trained a Chinese BERT text classifier to flag deceptive online advertisements. Built a Streamlit demo for pasting ad copy and inspecting risk-score output.</w:t>
             </w:r>
           </w:p>
           <w:p>
@@ -1405,7 +1405,7 @@
                 <w:color w:val="10141A"/>
                 <w:sz w:val="21"/>
               </w:rPr>
-              <w:t>rag-notes</w:t>
+              <w:t>Self-Learning Demos</w:t>
             </w:r>
             <w:r>
               <w:rPr>
@@ -1414,7 +1414,7 @@
                 <w:color w:val="6E7682"/>
                 <w:sz w:val="18"/>
               </w:rPr>
-              <w:t xml:space="preserve">    LangChain · Chroma · OpenAI Embeddings</w:t>
+              <w:t xml:space="preserve">    Python · Claude API · yfinance · ESP32</w:t>
             </w:r>
           </w:p>
           <w:p>
@@ -1428,81 +1428,7 @@
                 <w:color w:val="4A525C"/>
                 <w:sz w:val="20"/>
               </w:rPr>
-              <w:t>Personal RAG knowledge base with citation-required prompting and a confidence threshold. Hallucination 38% → 6% on a 50-question self-eval.</w:t>
-            </w:r>
-          </w:p>
-          <w:p>
-            <w:pPr>
-              <w:spacing w:before="40" w:after="20"/>
-            </w:pPr>
-            <w:r>
-              <w:rPr>
-                <w:b/>
-                <w:i w:val="0"/>
-                <w:color w:val="10141A"/>
-                <w:sz w:val="21"/>
-              </w:rPr>
-              <w:t>FakeAdDetector</w:t>
-            </w:r>
-            <w:r>
-              <w:rPr>
-                <w:b w:val="0"/>
-                <w:i w:val="0"/>
-                <w:color w:val="6E7682"/>
-                <w:sz w:val="18"/>
-              </w:rPr>
-              <w:t xml:space="preserve">    BERT · scikit-learn · Streamlit</w:t>
-            </w:r>
-          </w:p>
-          <w:p>
-            <w:pPr>
-              <w:spacing w:before="0" w:after="40" w:line="312" w:lineRule="auto"/>
-            </w:pPr>
-            <w:r>
-              <w:rPr>
-                <w:b w:val="0"/>
-                <w:i w:val="0"/>
-                <w:color w:val="4A525C"/>
-                <w:sz w:val="20"/>
-              </w:rPr>
-              <w:t>Fine-tuned bert-base-chinese on 1,200 hand-labeled Taiwanese ads — F1 = 0.91, +23% over baseline. Streamlit demo with explainable keyword highlights.</w:t>
-            </w:r>
-          </w:p>
-          <w:p>
-            <w:pPr>
-              <w:spacing w:before="40" w:after="20"/>
-            </w:pPr>
-            <w:r>
-              <w:rPr>
-                <w:b/>
-                <w:i w:val="0"/>
-                <w:color w:val="10141A"/>
-                <w:sz w:val="21"/>
-              </w:rPr>
-              <w:t>stock_tracker · iot_data</w:t>
-            </w:r>
-            <w:r>
-              <w:rPr>
-                <w:b w:val="0"/>
-                <w:i w:val="0"/>
-                <w:color w:val="6E7682"/>
-                <w:sz w:val="18"/>
-              </w:rPr>
-              <w:t xml:space="preserve">    Next.js · Gemini · ESP32 · MQTT</w:t>
-            </w:r>
-          </w:p>
-          <w:p>
-            <w:pPr>
-              <w:spacing w:before="0" w:after="40" w:line="312" w:lineRule="auto"/>
-            </w:pPr>
-            <w:r>
-              <w:rPr>
-                <w:b w:val="0"/>
-                <w:i w:val="0"/>
-                <w:color w:val="4A525C"/>
-                <w:sz w:val="20"/>
-              </w:rPr>
-              <w:t>Full-stack stock dashboard with nightly AI summaries and an ESP32 air-quality pipeline that prompts Gemini for ventilation suggestions via LINE.</w:t>
+              <w:t>claude-finance — practice with the Claude API tool-use loop using pandas helpers as typed tools. stock_tracker — yfinance + Plotly to chart RSI / MACD for a personal watchlist. iot_data — ESP32 + MQTT streaming sensor readings to a cloud broker.</w:t>
             </w:r>
           </w:p>
           <w:p>

</xml_diff>